<commit_message>
Tilføj REDIRECTS.md og TODO.md, opdatér README og tekstarkiv
Tekstarkivet er genereret igen uden den indsatte spam.

Co-Authored-By: Claude Opus 5.5 <noreply@anthropic.com>
Claude-Session: https://claude.ai/code/session_017p82BhMbatTAdXke9bXXFF
</commit_message>
<xml_diff>
--- a/tekstarkiv/tekster-fra-nadjakuszon-dk.docx
+++ b/tekstarkiv/tekster-fra-nadjakuszon-dk.docx
@@ -144,7 +144,7 @@
       <w:pPr>
         <w:spacing w:after="200"/>
       </w:pPr>
-      <w:hyperlink w:history="1" r:id="rIdp2vocttmibxsccwwyflaj">
+      <w:hyperlink w:history="1" r:id="rIdxvzsi9bzdhdazzebku_vo">
         <w:r>
           <w:rPr>
             <w:color w:val="7A7A7A"/>
@@ -269,7 +269,7 @@
       <w:pPr>
         <w:spacing w:after="200"/>
       </w:pPr>
-      <w:hyperlink w:history="1" r:id="rIdknu4nrpbiw-2zmlfvy0q0">
+      <w:hyperlink w:history="1" r:id="rIdiniyx-ahmdki5lfommr7s">
         <w:r>
           <w:rPr>
             <w:color w:val="7A7A7A"/>
@@ -1068,7 +1068,7 @@
       <w:pPr>
         <w:spacing w:after="200"/>
       </w:pPr>
-      <w:hyperlink w:history="1" r:id="rIdos52tzavghnd4wrswl3b5">
+      <w:hyperlink w:history="1" r:id="rIdylhs5-tqfzvs-mnf6sunz">
         <w:r>
           <w:rPr>
             <w:color w:val="7A7A7A"/>
@@ -1770,7 +1770,7 @@
       <w:pPr>
         <w:spacing w:after="200"/>
       </w:pPr>
-      <w:hyperlink w:history="1" r:id="rIdglxjwdk0qi52oyzvrym-t">
+      <w:hyperlink w:history="1" r:id="rIdwasyjjliqxwngmn_qdffq">
         <w:r>
           <w:rPr>
             <w:color w:val="7A7A7A"/>
@@ -2057,7 +2057,7 @@
       <w:pPr>
         <w:spacing w:after="200"/>
       </w:pPr>
-      <w:hyperlink w:history="1" r:id="rIdek2040j-nymmidxvyo44y">
+      <w:hyperlink w:history="1" r:id="rIdzrw-cwfbaxtbm8vtz1rpk">
         <w:r>
           <w:rPr>
             <w:color w:val="7A7A7A"/>
@@ -3781,7 +3781,7 @@
       <w:pPr>
         <w:spacing w:after="200"/>
       </w:pPr>
-      <w:hyperlink w:history="1" r:id="rIdwpe-fq1ixjne4ijxkyg6x">
+      <w:hyperlink w:history="1" r:id="rIdwdaklqpsddeljidfszkrr">
         <w:r>
           <w:rPr>
             <w:color w:val="7A7A7A"/>
@@ -5088,7 +5088,7 @@
       <w:pPr>
         <w:spacing w:after="200"/>
       </w:pPr>
-      <w:hyperlink w:history="1" r:id="rId2ozdwqsefymtuzayv3ew5">
+      <w:hyperlink w:history="1" r:id="rIdy2xj09eoulw8ujga9pkag">
         <w:r>
           <w:rPr>
             <w:color w:val="7A7A7A"/>
@@ -5633,7 +5633,7 @@
       <w:pPr>
         <w:spacing w:after="200"/>
       </w:pPr>
-      <w:hyperlink w:history="1" r:id="rIddelyb78sbmbxwihejdfsg">
+      <w:hyperlink w:history="1" r:id="rId8ubzzurh1psbensyxfews">
         <w:r>
           <w:rPr>
             <w:color w:val="7A7A7A"/>
@@ -6123,7 +6123,7 @@
       <w:pPr>
         <w:spacing w:after="200"/>
       </w:pPr>
-      <w:hyperlink w:history="1" r:id="rId4th8npmzeyepkyntseqj6">
+      <w:hyperlink w:history="1" r:id="rId3glx_9o452mypvfrdvbik">
         <w:r>
           <w:rPr>
             <w:color w:val="7A7A7A"/>
@@ -6366,7 +6366,7 @@
       <w:pPr>
         <w:spacing w:after="200"/>
       </w:pPr>
-      <w:hyperlink w:history="1" r:id="rIdmvsstjbltdf3ik0zfplu8">
+      <w:hyperlink w:history="1" r:id="rIdfzrlfrxvaqqjygcske7xt">
         <w:r>
           <w:rPr>
             <w:color w:val="7A7A7A"/>
@@ -6722,7 +6722,7 @@
       <w:pPr>
         <w:spacing w:after="200"/>
       </w:pPr>
-      <w:hyperlink w:history="1" r:id="rId_gl6h5xqmlktqwgbhvdgp">
+      <w:hyperlink w:history="1" r:id="rIdgapcttt8bqzzulwp_huga">
         <w:r>
           <w:rPr>
             <w:color w:val="7A7A7A"/>
@@ -7266,7 +7266,7 @@
       <w:pPr>
         <w:spacing w:after="200"/>
       </w:pPr>
-      <w:hyperlink w:history="1" r:id="rIdxr6uh_o2gf9cmsrf-q-ho">
+      <w:hyperlink w:history="1" r:id="rIdrebwd2dxlyhl1fsjqbfpc">
         <w:r>
           <w:rPr>
             <w:color w:val="7A7A7A"/>
@@ -7575,7 +7575,7 @@
       <w:pPr>
         <w:spacing w:after="200"/>
       </w:pPr>
-      <w:hyperlink w:history="1" r:id="rIdm1lowc6m4rpcjuyvs__-7">
+      <w:hyperlink w:history="1" r:id="rIdeolfsvduiiore5jsicl4_">
         <w:r>
           <w:rPr>
             <w:color w:val="7A7A7A"/>
@@ -7707,7 +7707,7 @@
       <w:pPr>
         <w:spacing w:after="200"/>
       </w:pPr>
-      <w:hyperlink w:history="1" r:id="rIdcwgnsajluffnmrrxyf7yo">
+      <w:hyperlink w:history="1" r:id="rIdoj9rpn1hwxkhznoydasks">
         <w:r>
           <w:rPr>
             <w:color w:val="7A7A7A"/>
@@ -7809,7 +7809,7 @@
       <w:pPr>
         <w:spacing w:after="200"/>
       </w:pPr>
-      <w:hyperlink w:history="1" r:id="rIdje4kfmda8wqt21ylylvvi">
+      <w:hyperlink w:history="1" r:id="rIdyyr52zmxve45hkgp0o7ty">
         <w:r>
           <w:rPr>
             <w:color w:val="7A7A7A"/>
@@ -7954,7 +7954,7 @@
       <w:pPr>
         <w:spacing w:after="200"/>
       </w:pPr>
-      <w:hyperlink w:history="1" r:id="rIdcbg1je_3l_unwhzc7dqp4">
+      <w:hyperlink w:history="1" r:id="rIdbs2wrdpter6gtnu8gsmvb">
         <w:r>
           <w:rPr>
             <w:color w:val="7A7A7A"/>
@@ -8264,7 +8264,7 @@
       <w:pPr>
         <w:spacing w:after="200"/>
       </w:pPr>
-      <w:hyperlink w:history="1" r:id="rIdvwkv7e1hxfj2k7dakhcbk">
+      <w:hyperlink w:history="1" r:id="rIdq-0nro6irt9tm0a396i6f">
         <w:r>
           <w:rPr>
             <w:color w:val="7A7A7A"/>
@@ -8411,7 +8411,7 @@
       <w:pPr>
         <w:spacing w:after="200"/>
       </w:pPr>
-      <w:hyperlink w:history="1" r:id="rIdsc9_7ml66mr5hwpkx96ya">
+      <w:hyperlink w:history="1" r:id="rIdrenzoihd3nble5mveahqo">
         <w:r>
           <w:rPr>
             <w:color w:val="7A7A7A"/>
@@ -8490,7 +8490,7 @@
       <w:pPr>
         <w:spacing w:after="200"/>
       </w:pPr>
-      <w:hyperlink w:history="1" r:id="rId1nwuuvydp1xaotwezssl-">
+      <w:hyperlink w:history="1" r:id="rIdanqx0wprxalvg4k37n5vz">
         <w:r>
           <w:rPr>
             <w:color w:val="7A7A7A"/>
@@ -8554,7 +8554,7 @@
       <w:pPr>
         <w:spacing w:after="200"/>
       </w:pPr>
-      <w:hyperlink w:history="1" r:id="rId2fs_evq8hlixfvjnaypwl">
+      <w:hyperlink w:history="1" r:id="rIdl2nmkv8fn7rsipktlpb-h">
         <w:r>
           <w:rPr>
             <w:color w:val="7A7A7A"/>
@@ -8636,7 +8636,7 @@
       <w:pPr>
         <w:spacing w:after="200"/>
       </w:pPr>
-      <w:hyperlink w:history="1" r:id="rIdphkx5k1fa9f7zhygkv8ri">
+      <w:hyperlink w:history="1" r:id="rIdixy1o5sunq1glgmpwgkn1">
         <w:r>
           <w:rPr>
             <w:color w:val="7A7A7A"/>
@@ -9004,7 +9004,7 @@
       <w:pPr>
         <w:spacing w:after="200"/>
       </w:pPr>
-      <w:hyperlink w:history="1" r:id="rIdwlrrgc7sqmi4zgl9sg-gs">
+      <w:hyperlink w:history="1" r:id="rIdef23sszza_yiwbfgaklju">
         <w:r>
           <w:rPr>
             <w:color w:val="7A7A7A"/>
@@ -9033,7 +9033,7 @@
       <w:pPr>
         <w:spacing w:after="200"/>
       </w:pPr>
-      <w:hyperlink w:history="1" r:id="rIdnzt9pyzdoeppfnx2_amjd">
+      <w:hyperlink w:history="1" r:id="rIdqljf3yy7tyikfg-evy21h">
         <w:r>
           <w:rPr>
             <w:color w:val="7A7A7A"/>
@@ -9112,7 +9112,7 @@
       <w:pPr>
         <w:spacing w:after="200"/>
       </w:pPr>
-      <w:hyperlink w:history="1" r:id="rIdra8pq_jut7pin-unyu0vt">
+      <w:hyperlink w:history="1" r:id="rId8btcxjthclu5ocnizu71b">
         <w:r>
           <w:rPr>
             <w:color w:val="7A7A7A"/>
@@ -9216,7 +9216,7 @@
       <w:pPr>
         <w:spacing w:after="200"/>
       </w:pPr>
-      <w:hyperlink w:history="1" r:id="rIdciw6rok3oqnk4fuqrycuk">
+      <w:hyperlink w:history="1" r:id="rIdlyb9dvez0kt6hbumtvy7x">
         <w:r>
           <w:rPr>
             <w:color w:val="7A7A7A"/>
@@ -9413,7 +9413,7 @@
       <w:pPr>
         <w:spacing w:after="200"/>
       </w:pPr>
-      <w:hyperlink w:history="1" r:id="rIdiljdd7tcll6y7s8xxmuoe">
+      <w:hyperlink w:history="1" r:id="rIdy_ymtfqcj2j9wq7rnqm-y">
         <w:r>
           <w:rPr>
             <w:color w:val="7A7A7A"/>
@@ -9600,7 +9600,7 @@
       <w:pPr>
         <w:spacing w:after="200"/>
       </w:pPr>
-      <w:hyperlink w:history="1" r:id="rId8i5hhav9k7vzg5vr8me8p">
+      <w:hyperlink w:history="1" r:id="rIdezc9p5xzkwhrgyzsdou8t">
         <w:r>
           <w:rPr>
             <w:color w:val="7A7A7A"/>
@@ -9796,7 +9796,7 @@
       <w:pPr>
         <w:spacing w:after="200"/>
       </w:pPr>
-      <w:hyperlink w:history="1" r:id="rIdxmdksol3ngjd4wmxetyh5">
+      <w:hyperlink w:history="1" r:id="rIdavuwl7m9wk8ywvlrusqsc">
         <w:r>
           <w:rPr>
             <w:color w:val="7A7A7A"/>
@@ -9900,7 +9900,7 @@
       <w:pPr>
         <w:spacing w:after="200"/>
       </w:pPr>
-      <w:hyperlink w:history="1" r:id="rIdh8iyqqe45drj_ip9m35gf">
+      <w:hyperlink w:history="1" r:id="rIdqpkbnowujustpvkktzdhs">
         <w:r>
           <w:rPr>
             <w:color w:val="7A7A7A"/>
@@ -9979,7 +9979,7 @@
       <w:pPr>
         <w:spacing w:after="200"/>
       </w:pPr>
-      <w:hyperlink w:history="1" r:id="rIdwnbbiumklxnli-1wcbdgr">
+      <w:hyperlink w:history="1" r:id="rIdjpd_vv2nwsq7qed9aosjw">
         <w:r>
           <w:rPr>
             <w:color w:val="7A7A7A"/>
@@ -10083,7 +10083,7 @@
       <w:pPr>
         <w:spacing w:after="200"/>
       </w:pPr>
-      <w:hyperlink w:history="1" r:id="rIdg9ii1ww0qcxh5amat4vn4">
+      <w:hyperlink w:history="1" r:id="rIdvkd0n7pq-uoura-v8v-gk">
         <w:r>
           <w:rPr>
             <w:color w:val="7A7A7A"/>
@@ -10441,7 +10441,7 @@
       <w:pPr>
         <w:spacing w:after="200"/>
       </w:pPr>
-      <w:hyperlink w:history="1" r:id="rIdy4lyci-qsgk3n89kxykxd">
+      <w:hyperlink w:history="1" r:id="rId0iq5auoxsl5eut6jdsbom">
         <w:r>
           <w:rPr>
             <w:color w:val="7A7A7A"/>
@@ -10515,7 +10515,7 @@
       <w:pPr>
         <w:spacing w:after="200"/>
       </w:pPr>
-      <w:hyperlink w:history="1" r:id="rIdlb6or-8omocynm_y4nw9k">
+      <w:hyperlink w:history="1" r:id="rIdrjcooy0ucpgyam76riqc2">
         <w:r>
           <w:rPr>
             <w:color w:val="7A7A7A"/>
@@ -10692,7 +10692,7 @@
       <w:pPr>
         <w:spacing w:after="200"/>
       </w:pPr>
-      <w:hyperlink w:history="1" r:id="rIdrhzys9kdezavtweb2-qva">
+      <w:hyperlink w:history="1" r:id="rIdlj5vt6xu9ygn2ikvfntgf">
         <w:r>
           <w:rPr>
             <w:color w:val="7A7A7A"/>
@@ -10802,7 +10802,7 @@
       <w:pPr>
         <w:spacing w:after="200"/>
       </w:pPr>
-      <w:hyperlink w:history="1" r:id="rIdwqchldvcgld77efgovzp7">
+      <w:hyperlink w:history="1" r:id="rId00jpl72vmkiyszxcj3q-f">
         <w:r>
           <w:rPr>
             <w:color w:val="7A7A7A"/>
@@ -10909,7 +10909,7 @@
       <w:pPr>
         <w:spacing w:after="200"/>
       </w:pPr>
-      <w:hyperlink w:history="1" r:id="rId_dykfwexzxpcgsho0tm7r">
+      <w:hyperlink w:history="1" r:id="rIdtbjbunadp7smuniz7s7yu">
         <w:r>
           <w:rPr>
             <w:color w:val="7A7A7A"/>
@@ -10988,7 +10988,7 @@
       <w:pPr>
         <w:spacing w:after="200"/>
       </w:pPr>
-      <w:hyperlink w:history="1" r:id="rIdgsock1a1hdzbbkgxbwwr_">
+      <w:hyperlink w:history="1" r:id="rIdvka1moq74kwalrismrkx6">
         <w:r>
           <w:rPr>
             <w:color w:val="7A7A7A"/>
@@ -11087,7 +11087,7 @@
       <w:pPr>
         <w:spacing w:after="200"/>
       </w:pPr>
-      <w:hyperlink w:history="1" r:id="rIdjrjohkkowh40uryzvfxoc">
+      <w:hyperlink w:history="1" r:id="rIdcswgnbzvemfxv4upv5fmx">
         <w:r>
           <w:rPr>
             <w:color w:val="7A7A7A"/>
@@ -11206,7 +11206,7 @@
       <w:pPr>
         <w:spacing w:after="200"/>
       </w:pPr>
-      <w:hyperlink w:history="1" r:id="rIdfzs4xm8ehj4dh5hf_zutk">
+      <w:hyperlink w:history="1" r:id="rId9vhkrw8fgfyprfamzappm">
         <w:r>
           <w:rPr>
             <w:color w:val="7A7A7A"/>
@@ -11270,7 +11270,7 @@
       <w:pPr>
         <w:spacing w:after="200"/>
       </w:pPr>
-      <w:hyperlink w:history="1" r:id="rIdrzxs5jxombyifcjrlvapj">
+      <w:hyperlink w:history="1" r:id="rIdgan2obanpd1dussgocp0y">
         <w:r>
           <w:rPr>
             <w:color w:val="7A7A7A"/>
@@ -11369,7 +11369,7 @@
       <w:pPr>
         <w:spacing w:after="200"/>
       </w:pPr>
-      <w:hyperlink w:history="1" r:id="rIdc6y5vl2io_latrs6slu2t">
+      <w:hyperlink w:history="1" r:id="rIdwganbmwu6mqzqkq7nrwfw">
         <w:r>
           <w:rPr>
             <w:color w:val="7A7A7A"/>
@@ -11732,7 +11732,7 @@
       <w:pPr>
         <w:spacing w:after="200"/>
       </w:pPr>
-      <w:hyperlink w:history="1" r:id="rIdhmbp6mvcrgkzjnkjjqol9">
+      <w:hyperlink w:history="1" r:id="rIdvfhxrsymgeuzrf9eh8pox">
         <w:r>
           <w:rPr>
             <w:color w:val="7A7A7A"/>
@@ -11869,7 +11869,7 @@
       <w:pPr>
         <w:spacing w:after="200"/>
       </w:pPr>
-      <w:hyperlink w:history="1" r:id="rIdyeydnbwuvlgksm3foijpv">
+      <w:hyperlink w:history="1" r:id="rId55jw0ich1mhdshzg0ctqd">
         <w:r>
           <w:rPr>
             <w:color w:val="7A7A7A"/>
@@ -12124,7 +12124,7 @@
       <w:pPr>
         <w:spacing w:after="200"/>
       </w:pPr>
-      <w:hyperlink w:history="1" r:id="rIdpehhhly31izxcti7v6tvh">
+      <w:hyperlink w:history="1" r:id="rIdswk-nvv4k0wmnudllo2y9">
         <w:r>
           <w:rPr>
             <w:color w:val="7A7A7A"/>
@@ -12213,7 +12213,7 @@
       <w:pPr>
         <w:spacing w:after="200"/>
       </w:pPr>
-      <w:hyperlink w:history="1" r:id="rIdti6nhielwdahmhaervg4i">
+      <w:hyperlink w:history="1" r:id="rIdugnmpjba_-aknp-lc_i5-">
         <w:r>
           <w:rPr>
             <w:color w:val="7A7A7A"/>
@@ -12322,7 +12322,7 @@
       <w:pPr>
         <w:spacing w:after="200"/>
       </w:pPr>
-      <w:hyperlink w:history="1" r:id="rIdiu94-lllxey6iuyezotgm">
+      <w:hyperlink w:history="1" r:id="rIdw_wh7fgf4xqhm-9ttn93e">
         <w:r>
           <w:rPr>
             <w:color w:val="7A7A7A"/>
@@ -12436,7 +12436,7 @@
       <w:pPr>
         <w:spacing w:after="200"/>
       </w:pPr>
-      <w:hyperlink w:history="1" r:id="rIdwb93nl_gyc5tqgsrrquux">
+      <w:hyperlink w:history="1" r:id="rIdzm01szajukyrq3jjzwery">
         <w:r>
           <w:rPr>
             <w:color w:val="7A7A7A"/>
@@ -12490,7 +12490,7 @@
       <w:pPr>
         <w:spacing w:after="200"/>
       </w:pPr>
-      <w:hyperlink w:history="1" r:id="rIdr4nzh9rbbc650tn_fpfpo">
+      <w:hyperlink w:history="1" r:id="rIdbjhpvdvaoc4xvxn_42gvn">
         <w:r>
           <w:rPr>
             <w:color w:val="7A7A7A"/>
@@ -12762,28 +12762,6 @@
     </w:p>
     <w:p>
       <w:r>
-        <w:t xml:space="preserve">Oplev den digitale casinostemning hos </w:t>
-      </w:r>
-      <w:r>
-        <w:t xml:space="preserve">QueenVegas</w:t>
-      </w:r>
-      <w:r>
-        <w:t xml:space="preserve">, og gå på opdagelse i en verden af spil og underholdning.</w:t>
-      </w:r>
-    </w:p>
-    <w:p>
-      <w:r>
-        <w:t xml:space="preserve">Nadjakuszon.dk deler informasjon og inspirasjon for en aktiv og interessant livsstil, mens </w:t>
-      </w:r>
-      <w:r>
-        <w:t xml:space="preserve">RoosterBet</w:t>
-      </w:r>
-      <w:r>
-        <w:t xml:space="preserve"> tilbyr voksne brukere spennende online underholdning og digitale spillopplevelser.</w:t>
-      </w:r>
-    </w:p>
-    <w:p>
-      <w:r>
         <w:t xml:space="preserve">”Er du fx lige sprunget ud af et forhold og har brug for at finde dig selv igen?</w:t>
       </w:r>
     </w:p>
@@ -12819,7 +12797,7 @@
       <w:pPr>
         <w:spacing w:after="200"/>
       </w:pPr>
-      <w:hyperlink w:history="1" r:id="rIdoub5jkry3oiza5umrfl_a">
+      <w:hyperlink w:history="1" r:id="rIdwo5ntv7j65zggul5ayw-e">
         <w:r>
           <w:rPr>
             <w:color w:val="7A7A7A"/>

</xml_diff>